<commit_message>
fejl doc menu plan tabla
</commit_message>
<xml_diff>
--- a/dokumentaciok/fejlesztoi/fejlesztoi_doc.docx
+++ b/dokumentaciok/fejlesztoi/fejlesztoi_doc.docx
@@ -1189,8 +1189,6 @@
           </wp:inline>
         </w:drawing>
       </w:r>
-      <w:bookmarkStart w:id="0" w:name="_GoBack"/>
-      <w:bookmarkEnd w:id="0"/>
     </w:p>
     <w:p>
       <w:pPr>
@@ -1681,6 +1679,7 @@
       <w:proofErr w:type="spellStart"/>
       <w:r>
         <w:rPr>
+          <w:b/>
           <w:sz w:val="24"/>
           <w:szCs w:val="32"/>
         </w:rPr>
@@ -1694,6 +1693,1316 @@
         </w:rPr>
         <w:t xml:space="preserve">: </w:t>
       </w:r>
+      <w:r>
+        <w:rPr>
+          <w:sz w:val="24"/>
+          <w:szCs w:val="32"/>
+        </w:rPr>
+        <w:t xml:space="preserve">A felhasználó által kiválasztott profilkép, mely mentésre kerül az </w:t>
+      </w:r>
+      <w:proofErr w:type="spellStart"/>
+      <w:r>
+        <w:rPr>
+          <w:sz w:val="24"/>
+          <w:szCs w:val="32"/>
+        </w:rPr>
+        <w:t>uploads</w:t>
+      </w:r>
+      <w:proofErr w:type="spellEnd"/>
+      <w:r>
+        <w:rPr>
+          <w:sz w:val="24"/>
+          <w:szCs w:val="32"/>
+        </w:rPr>
+        <w:t xml:space="preserve"> mappába. Ezt az útvonalat menti az adatbázisba és tölti be onnan.</w:t>
+      </w:r>
+    </w:p>
+    <w:p>
+      <w:pPr>
+        <w:spacing w:after="0" w:line="360" w:lineRule="auto"/>
+        <w:jc w:val="both"/>
+        <w:rPr>
+          <w:sz w:val="24"/>
+          <w:szCs w:val="32"/>
+        </w:rPr>
+      </w:pPr>
+      <w:proofErr w:type="spellStart"/>
+      <w:r>
+        <w:rPr>
+          <w:b/>
+          <w:sz w:val="24"/>
+          <w:szCs w:val="32"/>
+        </w:rPr>
+        <w:t>about_me</w:t>
+      </w:r>
+      <w:proofErr w:type="spellEnd"/>
+      <w:r>
+        <w:rPr>
+          <w:sz w:val="24"/>
+          <w:szCs w:val="32"/>
+        </w:rPr>
+        <w:t>: A felhasználó bemutatkozásra használhatja, a profil.php oldalon tudja változtatni. Ez a szöveg kerül elmentésre.</w:t>
+      </w:r>
+    </w:p>
+    <w:p>
+      <w:pPr>
+        <w:spacing w:after="0" w:line="360" w:lineRule="auto"/>
+        <w:jc w:val="center"/>
+        <w:rPr>
+          <w:b/>
+          <w:sz w:val="32"/>
+          <w:szCs w:val="32"/>
+        </w:rPr>
+      </w:pPr>
+      <w:r>
+        <w:rPr>
+          <w:b/>
+          <w:sz w:val="32"/>
+          <w:szCs w:val="32"/>
+        </w:rPr>
+        <w:t>A ’</w:t>
+      </w:r>
+      <w:proofErr w:type="spellStart"/>
+      <w:r>
+        <w:rPr>
+          <w:b/>
+          <w:sz w:val="32"/>
+          <w:szCs w:val="32"/>
+        </w:rPr>
+        <w:t>recipes</w:t>
+      </w:r>
+      <w:proofErr w:type="spellEnd"/>
+      <w:r>
+        <w:rPr>
+          <w:b/>
+          <w:sz w:val="32"/>
+          <w:szCs w:val="32"/>
+        </w:rPr>
+        <w:t>’ tábla</w:t>
+      </w:r>
+    </w:p>
+    <w:p>
+      <w:pPr>
+        <w:spacing w:after="0" w:line="360" w:lineRule="auto"/>
+        <w:jc w:val="both"/>
+        <w:rPr>
+          <w:sz w:val="24"/>
+          <w:szCs w:val="32"/>
+        </w:rPr>
+      </w:pPr>
+      <w:r>
+        <w:rPr>
+          <w:noProof/>
+          <w:sz w:val="24"/>
+          <w:szCs w:val="32"/>
+        </w:rPr>
+        <w:drawing>
+          <wp:anchor distT="0" distB="0" distL="114300" distR="114300" simplePos="0" relativeHeight="251665408" behindDoc="1" locked="0" layoutInCell="1" allowOverlap="1">
+            <wp:simplePos x="0" y="0"/>
+            <wp:positionH relativeFrom="column">
+              <wp:posOffset>-2173</wp:posOffset>
+            </wp:positionH>
+            <wp:positionV relativeFrom="paragraph">
+              <wp:posOffset>1124</wp:posOffset>
+            </wp:positionV>
+            <wp:extent cx="1205193" cy="2181137"/>
+            <wp:effectExtent l="0" t="0" r="0" b="0"/>
+            <wp:wrapTight wrapText="bothSides">
+              <wp:wrapPolygon edited="0">
+                <wp:start x="0" y="0"/>
+                <wp:lineTo x="0" y="21323"/>
+                <wp:lineTo x="21179" y="21323"/>
+                <wp:lineTo x="21179" y="0"/>
+                <wp:lineTo x="0" y="0"/>
+              </wp:wrapPolygon>
+            </wp:wrapTight>
+            <wp:docPr id="9" name="Kép 9"/>
+            <wp:cNvGraphicFramePr>
+              <a:graphicFrameLocks xmlns:a="http://schemas.openxmlformats.org/drawingml/2006/main" noChangeAspect="1"/>
+            </wp:cNvGraphicFramePr>
+            <a:graphic xmlns:a="http://schemas.openxmlformats.org/drawingml/2006/main">
+              <a:graphicData uri="http://schemas.openxmlformats.org/drawingml/2006/picture">
+                <pic:pic xmlns:pic="http://schemas.openxmlformats.org/drawingml/2006/picture">
+                  <pic:nvPicPr>
+                    <pic:cNvPr id="9" name="recipes.PNG"/>
+                    <pic:cNvPicPr/>
+                  </pic:nvPicPr>
+                  <pic:blipFill>
+                    <a:blip r:embed="rId14">
+                      <a:extLst>
+                        <a:ext uri="{28A0092B-C50C-407E-A947-70E740481C1C}">
+                          <a14:useLocalDpi xmlns:a14="http://schemas.microsoft.com/office/drawing/2010/main" val="0"/>
+                        </a:ext>
+                      </a:extLst>
+                    </a:blip>
+                    <a:stretch>
+                      <a:fillRect/>
+                    </a:stretch>
+                  </pic:blipFill>
+                  <pic:spPr>
+                    <a:xfrm>
+                      <a:off x="0" y="0"/>
+                      <a:ext cx="1205193" cy="2181137"/>
+                    </a:xfrm>
+                    <a:prstGeom prst="rect">
+                      <a:avLst/>
+                    </a:prstGeom>
+                  </pic:spPr>
+                </pic:pic>
+              </a:graphicData>
+            </a:graphic>
+          </wp:anchor>
+        </w:drawing>
+      </w:r>
+      <w:r>
+        <w:rPr>
+          <w:sz w:val="24"/>
+          <w:szCs w:val="32"/>
+        </w:rPr>
+        <w:t>A ’</w:t>
+      </w:r>
+      <w:proofErr w:type="spellStart"/>
+      <w:r>
+        <w:rPr>
+          <w:sz w:val="24"/>
+          <w:szCs w:val="32"/>
+        </w:rPr>
+        <w:t>recipes</w:t>
+      </w:r>
+      <w:proofErr w:type="spellEnd"/>
+      <w:r>
+        <w:rPr>
+          <w:sz w:val="24"/>
+          <w:szCs w:val="32"/>
+        </w:rPr>
+        <w:t>’ tábla tárolja az összes receptet, mely megtalálható a weboldalon. Ebből töltenek be a receptek oldalai ID szerint. Ide kerülnek a felhasználók által feltöltött receptek is.</w:t>
+      </w:r>
+    </w:p>
+    <w:p>
+      <w:pPr>
+        <w:spacing w:after="0" w:line="360" w:lineRule="auto"/>
+        <w:jc w:val="both"/>
+        <w:rPr>
+          <w:sz w:val="24"/>
+          <w:szCs w:val="32"/>
+        </w:rPr>
+      </w:pPr>
+      <w:proofErr w:type="spellStart"/>
+      <w:r>
+        <w:rPr>
+          <w:b/>
+          <w:sz w:val="24"/>
+          <w:szCs w:val="32"/>
+        </w:rPr>
+        <w:t>id</w:t>
+      </w:r>
+      <w:proofErr w:type="spellEnd"/>
+      <w:r>
+        <w:rPr>
+          <w:sz w:val="24"/>
+          <w:szCs w:val="32"/>
+        </w:rPr>
+        <w:t>: A recept ID-ja.</w:t>
+      </w:r>
+    </w:p>
+    <w:p>
+      <w:pPr>
+        <w:spacing w:after="0" w:line="360" w:lineRule="auto"/>
+        <w:jc w:val="both"/>
+        <w:rPr>
+          <w:sz w:val="24"/>
+          <w:szCs w:val="32"/>
+        </w:rPr>
+      </w:pPr>
+      <w:proofErr w:type="spellStart"/>
+      <w:r>
+        <w:rPr>
+          <w:b/>
+          <w:sz w:val="24"/>
+          <w:szCs w:val="32"/>
+        </w:rPr>
+        <w:t>title</w:t>
+      </w:r>
+      <w:proofErr w:type="spellEnd"/>
+      <w:r>
+        <w:rPr>
+          <w:sz w:val="24"/>
+          <w:szCs w:val="32"/>
+        </w:rPr>
+        <w:t>: A recept neve/címe.</w:t>
+      </w:r>
+    </w:p>
+    <w:p>
+      <w:pPr>
+        <w:spacing w:after="0" w:line="360" w:lineRule="auto"/>
+        <w:jc w:val="both"/>
+        <w:rPr>
+          <w:sz w:val="24"/>
+          <w:szCs w:val="32"/>
+        </w:rPr>
+      </w:pPr>
+      <w:proofErr w:type="spellStart"/>
+      <w:r>
+        <w:rPr>
+          <w:b/>
+          <w:sz w:val="24"/>
+          <w:szCs w:val="32"/>
+        </w:rPr>
+        <w:t>image_url</w:t>
+      </w:r>
+      <w:proofErr w:type="spellEnd"/>
+      <w:r>
+        <w:rPr>
+          <w:sz w:val="24"/>
+          <w:szCs w:val="32"/>
+        </w:rPr>
+        <w:t xml:space="preserve">: A </w:t>
+      </w:r>
+      <w:r>
+        <w:rPr>
+          <w:sz w:val="24"/>
+          <w:szCs w:val="32"/>
+        </w:rPr>
+        <w:t xml:space="preserve">recept képe, melyet az </w:t>
+      </w:r>
+      <w:proofErr w:type="spellStart"/>
+      <w:r>
+        <w:rPr>
+          <w:sz w:val="24"/>
+          <w:szCs w:val="32"/>
+        </w:rPr>
+        <w:t>imgs</w:t>
+      </w:r>
+      <w:proofErr w:type="spellEnd"/>
+      <w:r>
+        <w:rPr>
+          <w:sz w:val="24"/>
+          <w:szCs w:val="32"/>
+        </w:rPr>
+        <w:t xml:space="preserve"> mappában tárolunk.</w:t>
+      </w:r>
+    </w:p>
+    <w:p>
+      <w:pPr>
+        <w:spacing w:after="0" w:line="360" w:lineRule="auto"/>
+        <w:jc w:val="both"/>
+        <w:rPr>
+          <w:sz w:val="24"/>
+          <w:szCs w:val="32"/>
+        </w:rPr>
+      </w:pPr>
+      <w:proofErr w:type="spellStart"/>
+      <w:r>
+        <w:rPr>
+          <w:b/>
+          <w:sz w:val="24"/>
+          <w:szCs w:val="32"/>
+        </w:rPr>
+        <w:t>base-servings</w:t>
+      </w:r>
+      <w:proofErr w:type="spellEnd"/>
+      <w:r>
+        <w:rPr>
+          <w:sz w:val="24"/>
+          <w:szCs w:val="32"/>
+        </w:rPr>
+        <w:t>: Be lehet állítani, hogy alapból hány főre szóljanak a hozzávalók mennyiségek. (Egyelőre a recept feltöltésnél nincs ilyen lehetőség)</w:t>
+      </w:r>
+    </w:p>
+    <w:p>
+      <w:pPr>
+        <w:spacing w:after="0" w:line="360" w:lineRule="auto"/>
+        <w:jc w:val="both"/>
+        <w:rPr>
+          <w:sz w:val="24"/>
+          <w:szCs w:val="32"/>
+        </w:rPr>
+      </w:pPr>
+      <w:proofErr w:type="spellStart"/>
+      <w:r>
+        <w:rPr>
+          <w:b/>
+          <w:sz w:val="24"/>
+          <w:szCs w:val="32"/>
+        </w:rPr>
+        <w:t>created_at</w:t>
+      </w:r>
+      <w:proofErr w:type="spellEnd"/>
+      <w:r>
+        <w:rPr>
+          <w:sz w:val="24"/>
+          <w:szCs w:val="32"/>
+        </w:rPr>
+        <w:t>: A recept feltöltésének ideje.</w:t>
+      </w:r>
+    </w:p>
+    <w:p>
+      <w:pPr>
+        <w:spacing w:after="0" w:line="360" w:lineRule="auto"/>
+        <w:jc w:val="both"/>
+        <w:rPr>
+          <w:sz w:val="24"/>
+          <w:szCs w:val="32"/>
+        </w:rPr>
+      </w:pPr>
+      <w:proofErr w:type="spellStart"/>
+      <w:r>
+        <w:rPr>
+          <w:b/>
+          <w:sz w:val="24"/>
+          <w:szCs w:val="32"/>
+        </w:rPr>
+        <w:t>created_by</w:t>
+      </w:r>
+      <w:proofErr w:type="spellEnd"/>
+      <w:r>
+        <w:rPr>
+          <w:sz w:val="24"/>
+          <w:szCs w:val="32"/>
+        </w:rPr>
+        <w:t>: A recept készítőjének ID-ja.</w:t>
+      </w:r>
+    </w:p>
+    <w:p>
+      <w:pPr>
+        <w:spacing w:after="0" w:line="360" w:lineRule="auto"/>
+        <w:jc w:val="both"/>
+        <w:rPr>
+          <w:sz w:val="24"/>
+          <w:szCs w:val="32"/>
+        </w:rPr>
+      </w:pPr>
+      <w:proofErr w:type="spellStart"/>
+      <w:r>
+        <w:rPr>
+          <w:b/>
+          <w:sz w:val="24"/>
+          <w:szCs w:val="32"/>
+        </w:rPr>
+        <w:t>time_minutes</w:t>
+      </w:r>
+      <w:proofErr w:type="spellEnd"/>
+      <w:r>
+        <w:rPr>
+          <w:sz w:val="24"/>
+          <w:szCs w:val="32"/>
+        </w:rPr>
+        <w:t>: Mennyi ideig tart elkészíteni a receptet.</w:t>
+      </w:r>
+    </w:p>
+    <w:p>
+      <w:pPr>
+        <w:spacing w:after="0" w:line="360" w:lineRule="auto"/>
+        <w:jc w:val="both"/>
+        <w:rPr>
+          <w:sz w:val="24"/>
+          <w:szCs w:val="32"/>
+        </w:rPr>
+      </w:pPr>
+      <w:r>
+        <w:rPr>
+          <w:b/>
+          <w:sz w:val="24"/>
+          <w:szCs w:val="32"/>
+        </w:rPr>
+        <w:t>cost</w:t>
+      </w:r>
+      <w:r>
+        <w:rPr>
+          <w:sz w:val="24"/>
+          <w:szCs w:val="32"/>
+        </w:rPr>
+        <w:t>: Mennyibe kerül az elkészítés. (Olcsó/Megfizethető/Drága)</w:t>
+      </w:r>
+    </w:p>
+    <w:p>
+      <w:pPr>
+        <w:spacing w:after="0" w:line="360" w:lineRule="auto"/>
+        <w:jc w:val="both"/>
+        <w:rPr>
+          <w:sz w:val="24"/>
+          <w:szCs w:val="32"/>
+        </w:rPr>
+      </w:pPr>
+      <w:proofErr w:type="spellStart"/>
+      <w:r>
+        <w:rPr>
+          <w:b/>
+          <w:sz w:val="24"/>
+          <w:szCs w:val="32"/>
+        </w:rPr>
+        <w:t>difficulty</w:t>
+      </w:r>
+      <w:proofErr w:type="spellEnd"/>
+      <w:r>
+        <w:rPr>
+          <w:sz w:val="24"/>
+          <w:szCs w:val="32"/>
+        </w:rPr>
+        <w:t>: Mennyire nehéz elkészíteni a receptet. (Könnyű/Közepes/Nehéz)</w:t>
+      </w:r>
+    </w:p>
+    <w:p>
+      <w:pPr>
+        <w:spacing w:after="0" w:line="360" w:lineRule="auto"/>
+        <w:jc w:val="center"/>
+        <w:rPr>
+          <w:b/>
+          <w:sz w:val="32"/>
+          <w:szCs w:val="32"/>
+        </w:rPr>
+      </w:pPr>
+      <w:r>
+        <w:rPr>
+          <w:b/>
+          <w:sz w:val="32"/>
+          <w:szCs w:val="32"/>
+        </w:rPr>
+        <w:lastRenderedPageBreak/>
+        <w:t>A ’</w:t>
+      </w:r>
+      <w:proofErr w:type="spellStart"/>
+      <w:r>
+        <w:rPr>
+          <w:b/>
+          <w:sz w:val="32"/>
+          <w:szCs w:val="32"/>
+        </w:rPr>
+        <w:t>recipe_ingredients</w:t>
+      </w:r>
+      <w:proofErr w:type="spellEnd"/>
+      <w:r>
+        <w:rPr>
+          <w:b/>
+          <w:sz w:val="32"/>
+          <w:szCs w:val="32"/>
+        </w:rPr>
+        <w:t>’ tábla</w:t>
+      </w:r>
+    </w:p>
+    <w:p>
+      <w:pPr>
+        <w:spacing w:after="0" w:line="360" w:lineRule="auto"/>
+        <w:rPr>
+          <w:sz w:val="24"/>
+          <w:szCs w:val="24"/>
+        </w:rPr>
+      </w:pPr>
+      <w:r>
+        <w:rPr>
+          <w:b/>
+          <w:noProof/>
+          <w:sz w:val="32"/>
+          <w:szCs w:val="32"/>
+        </w:rPr>
+        <w:drawing>
+          <wp:anchor distT="0" distB="0" distL="114300" distR="114300" simplePos="0" relativeHeight="251666432" behindDoc="1" locked="0" layoutInCell="1" allowOverlap="1">
+            <wp:simplePos x="0" y="0"/>
+            <wp:positionH relativeFrom="margin">
+              <wp:align>left</wp:align>
+            </wp:positionH>
+            <wp:positionV relativeFrom="paragraph">
+              <wp:posOffset>23926</wp:posOffset>
+            </wp:positionV>
+            <wp:extent cx="1896110" cy="1484630"/>
+            <wp:effectExtent l="0" t="0" r="8890" b="1270"/>
+            <wp:wrapTight wrapText="bothSides">
+              <wp:wrapPolygon edited="0">
+                <wp:start x="0" y="0"/>
+                <wp:lineTo x="0" y="21341"/>
+                <wp:lineTo x="21484" y="21341"/>
+                <wp:lineTo x="21484" y="0"/>
+                <wp:lineTo x="0" y="0"/>
+              </wp:wrapPolygon>
+            </wp:wrapTight>
+            <wp:docPr id="10" name="Kép 10"/>
+            <wp:cNvGraphicFramePr>
+              <a:graphicFrameLocks xmlns:a="http://schemas.openxmlformats.org/drawingml/2006/main" noChangeAspect="1"/>
+            </wp:cNvGraphicFramePr>
+            <a:graphic xmlns:a="http://schemas.openxmlformats.org/drawingml/2006/main">
+              <a:graphicData uri="http://schemas.openxmlformats.org/drawingml/2006/picture">
+                <pic:pic xmlns:pic="http://schemas.openxmlformats.org/drawingml/2006/picture">
+                  <pic:nvPicPr>
+                    <pic:cNvPr id="10" name="ingredients.PNG"/>
+                    <pic:cNvPicPr/>
+                  </pic:nvPicPr>
+                  <pic:blipFill>
+                    <a:blip r:embed="rId15">
+                      <a:extLst>
+                        <a:ext uri="{28A0092B-C50C-407E-A947-70E740481C1C}">
+                          <a14:useLocalDpi xmlns:a14="http://schemas.microsoft.com/office/drawing/2010/main" val="0"/>
+                        </a:ext>
+                      </a:extLst>
+                    </a:blip>
+                    <a:stretch>
+                      <a:fillRect/>
+                    </a:stretch>
+                  </pic:blipFill>
+                  <pic:spPr>
+                    <a:xfrm>
+                      <a:off x="0" y="0"/>
+                      <a:ext cx="1963431" cy="1537262"/>
+                    </a:xfrm>
+                    <a:prstGeom prst="rect">
+                      <a:avLst/>
+                    </a:prstGeom>
+                  </pic:spPr>
+                </pic:pic>
+              </a:graphicData>
+            </a:graphic>
+            <wp14:sizeRelH relativeFrom="margin">
+              <wp14:pctWidth>0</wp14:pctWidth>
+            </wp14:sizeRelH>
+            <wp14:sizeRelV relativeFrom="margin">
+              <wp14:pctHeight>0</wp14:pctHeight>
+            </wp14:sizeRelV>
+          </wp:anchor>
+        </w:drawing>
+      </w:r>
+      <w:r>
+        <w:rPr>
+          <w:sz w:val="24"/>
+          <w:szCs w:val="24"/>
+        </w:rPr>
+        <w:t>A ’</w:t>
+      </w:r>
+      <w:proofErr w:type="spellStart"/>
+      <w:r>
+        <w:rPr>
+          <w:sz w:val="24"/>
+          <w:szCs w:val="24"/>
+        </w:rPr>
+        <w:t>recipe_ingredients</w:t>
+      </w:r>
+      <w:proofErr w:type="spellEnd"/>
+      <w:r>
+        <w:rPr>
+          <w:sz w:val="24"/>
+          <w:szCs w:val="24"/>
+        </w:rPr>
+        <w:t>’ tábla tárolja az összes olyan hozzávalót, melyet valamelyik felhasználó</w:t>
+      </w:r>
+      <w:r>
+        <w:rPr>
+          <w:sz w:val="24"/>
+          <w:szCs w:val="24"/>
+        </w:rPr>
+        <w:t xml:space="preserve"> már beírt valamikor a recept feltöltésekor. </w:t>
+      </w:r>
+    </w:p>
+    <w:p>
+      <w:pPr>
+        <w:spacing w:after="0" w:line="360" w:lineRule="auto"/>
+        <w:rPr>
+          <w:sz w:val="24"/>
+          <w:szCs w:val="24"/>
+        </w:rPr>
+      </w:pPr>
+      <w:proofErr w:type="spellStart"/>
+      <w:r>
+        <w:rPr>
+          <w:b/>
+          <w:sz w:val="24"/>
+          <w:szCs w:val="24"/>
+        </w:rPr>
+        <w:t>id</w:t>
+      </w:r>
+      <w:proofErr w:type="spellEnd"/>
+      <w:r>
+        <w:rPr>
+          <w:sz w:val="24"/>
+          <w:szCs w:val="24"/>
+        </w:rPr>
+        <w:t xml:space="preserve">: A hozzávaló </w:t>
+      </w:r>
+      <w:r>
+        <w:rPr>
+          <w:sz w:val="24"/>
+          <w:szCs w:val="24"/>
+        </w:rPr>
+        <w:t>ID</w:t>
+      </w:r>
+      <w:r>
+        <w:rPr>
+          <w:sz w:val="24"/>
+          <w:szCs w:val="24"/>
+        </w:rPr>
+        <w:t>-ja.</w:t>
+      </w:r>
+    </w:p>
+    <w:p>
+      <w:pPr>
+        <w:spacing w:after="0" w:line="360" w:lineRule="auto"/>
+        <w:rPr>
+          <w:sz w:val="24"/>
+          <w:szCs w:val="24"/>
+        </w:rPr>
+      </w:pPr>
+      <w:proofErr w:type="spellStart"/>
+      <w:r>
+        <w:rPr>
+          <w:b/>
+          <w:sz w:val="24"/>
+          <w:szCs w:val="24"/>
+        </w:rPr>
+        <w:t>recipe_id</w:t>
+      </w:r>
+      <w:proofErr w:type="spellEnd"/>
+      <w:r>
+        <w:rPr>
+          <w:sz w:val="24"/>
+          <w:szCs w:val="24"/>
+        </w:rPr>
+        <w:t>: A hozzávalóhoz kapcsolódó recept.</w:t>
+      </w:r>
+    </w:p>
+    <w:p>
+      <w:pPr>
+        <w:spacing w:after="0" w:line="360" w:lineRule="auto"/>
+        <w:rPr>
+          <w:sz w:val="24"/>
+          <w:szCs w:val="24"/>
+        </w:rPr>
+      </w:pPr>
+      <w:proofErr w:type="spellStart"/>
+      <w:r>
+        <w:rPr>
+          <w:b/>
+          <w:sz w:val="24"/>
+          <w:szCs w:val="24"/>
+        </w:rPr>
+        <w:t>amount</w:t>
+      </w:r>
+      <w:proofErr w:type="spellEnd"/>
+      <w:r>
+        <w:rPr>
+          <w:sz w:val="24"/>
+          <w:szCs w:val="24"/>
+        </w:rPr>
+        <w:t>: A hozzávaló mennyisége.</w:t>
+      </w:r>
+    </w:p>
+    <w:p>
+      <w:pPr>
+        <w:spacing w:after="0" w:line="360" w:lineRule="auto"/>
+        <w:rPr>
+          <w:sz w:val="24"/>
+          <w:szCs w:val="24"/>
+        </w:rPr>
+      </w:pPr>
+      <w:r>
+        <w:rPr>
+          <w:b/>
+          <w:sz w:val="24"/>
+          <w:szCs w:val="24"/>
+        </w:rPr>
+        <w:t>unit</w:t>
+      </w:r>
+      <w:r>
+        <w:rPr>
+          <w:sz w:val="24"/>
+          <w:szCs w:val="24"/>
+        </w:rPr>
+        <w:t>: A hozzávaló mértékegysége.</w:t>
+      </w:r>
+    </w:p>
+    <w:p>
+      <w:pPr>
+        <w:spacing w:after="0" w:line="360" w:lineRule="auto"/>
+        <w:rPr>
+          <w:sz w:val="24"/>
+          <w:szCs w:val="24"/>
+        </w:rPr>
+      </w:pPr>
+      <w:proofErr w:type="spellStart"/>
+      <w:r>
+        <w:rPr>
+          <w:b/>
+          <w:sz w:val="24"/>
+          <w:szCs w:val="24"/>
+        </w:rPr>
+        <w:t>name</w:t>
+      </w:r>
+      <w:proofErr w:type="spellEnd"/>
+      <w:r>
+        <w:rPr>
+          <w:sz w:val="24"/>
+          <w:szCs w:val="24"/>
+        </w:rPr>
+        <w:t>: A hozzávaló neve.</w:t>
+      </w:r>
+    </w:p>
+    <w:p>
+      <w:pPr>
+        <w:spacing w:after="0" w:line="360" w:lineRule="auto"/>
+        <w:jc w:val="center"/>
+        <w:rPr>
+          <w:b/>
+          <w:sz w:val="32"/>
+          <w:szCs w:val="32"/>
+        </w:rPr>
+      </w:pPr>
+      <w:r>
+        <w:rPr>
+          <w:b/>
+          <w:sz w:val="32"/>
+          <w:szCs w:val="32"/>
+        </w:rPr>
+        <w:t>A ’</w:t>
+      </w:r>
+      <w:proofErr w:type="spellStart"/>
+      <w:r>
+        <w:rPr>
+          <w:b/>
+          <w:sz w:val="32"/>
+          <w:szCs w:val="32"/>
+        </w:rPr>
+        <w:t>recipe_steps</w:t>
+      </w:r>
+      <w:proofErr w:type="spellEnd"/>
+      <w:r>
+        <w:rPr>
+          <w:b/>
+          <w:sz w:val="32"/>
+          <w:szCs w:val="32"/>
+        </w:rPr>
+        <w:t>’ tábla</w:t>
+      </w:r>
+    </w:p>
+    <w:p>
+      <w:pPr>
+        <w:spacing w:after="0" w:line="360" w:lineRule="auto"/>
+        <w:rPr>
+          <w:sz w:val="24"/>
+          <w:szCs w:val="24"/>
+        </w:rPr>
+      </w:pPr>
+      <w:r>
+        <w:rPr>
+          <w:noProof/>
+          <w:sz w:val="24"/>
+          <w:szCs w:val="24"/>
+        </w:rPr>
+        <w:drawing>
+          <wp:anchor distT="0" distB="0" distL="114300" distR="114300" simplePos="0" relativeHeight="251667456" behindDoc="1" locked="0" layoutInCell="1" allowOverlap="1">
+            <wp:simplePos x="0" y="0"/>
+            <wp:positionH relativeFrom="column">
+              <wp:posOffset>-2173</wp:posOffset>
+            </wp:positionH>
+            <wp:positionV relativeFrom="paragraph">
+              <wp:posOffset>-4410</wp:posOffset>
+            </wp:positionV>
+            <wp:extent cx="1560352" cy="1236505"/>
+            <wp:effectExtent l="0" t="0" r="1905" b="1905"/>
+            <wp:wrapTight wrapText="bothSides">
+              <wp:wrapPolygon edited="0">
+                <wp:start x="0" y="0"/>
+                <wp:lineTo x="0" y="21300"/>
+                <wp:lineTo x="21363" y="21300"/>
+                <wp:lineTo x="21363" y="0"/>
+                <wp:lineTo x="0" y="0"/>
+              </wp:wrapPolygon>
+            </wp:wrapTight>
+            <wp:docPr id="11" name="Kép 11"/>
+            <wp:cNvGraphicFramePr>
+              <a:graphicFrameLocks xmlns:a="http://schemas.openxmlformats.org/drawingml/2006/main" noChangeAspect="1"/>
+            </wp:cNvGraphicFramePr>
+            <a:graphic xmlns:a="http://schemas.openxmlformats.org/drawingml/2006/main">
+              <a:graphicData uri="http://schemas.openxmlformats.org/drawingml/2006/picture">
+                <pic:pic xmlns:pic="http://schemas.openxmlformats.org/drawingml/2006/picture">
+                  <pic:nvPicPr>
+                    <pic:cNvPr id="11" name="steps.PNG"/>
+                    <pic:cNvPicPr/>
+                  </pic:nvPicPr>
+                  <pic:blipFill>
+                    <a:blip r:embed="rId16">
+                      <a:extLst>
+                        <a:ext uri="{28A0092B-C50C-407E-A947-70E740481C1C}">
+                          <a14:useLocalDpi xmlns:a14="http://schemas.microsoft.com/office/drawing/2010/main" val="0"/>
+                        </a:ext>
+                      </a:extLst>
+                    </a:blip>
+                    <a:stretch>
+                      <a:fillRect/>
+                    </a:stretch>
+                  </pic:blipFill>
+                  <pic:spPr>
+                    <a:xfrm>
+                      <a:off x="0" y="0"/>
+                      <a:ext cx="1560352" cy="1236505"/>
+                    </a:xfrm>
+                    <a:prstGeom prst="rect">
+                      <a:avLst/>
+                    </a:prstGeom>
+                  </pic:spPr>
+                </pic:pic>
+              </a:graphicData>
+            </a:graphic>
+          </wp:anchor>
+        </w:drawing>
+      </w:r>
+      <w:r>
+        <w:rPr>
+          <w:sz w:val="24"/>
+          <w:szCs w:val="24"/>
+        </w:rPr>
+        <w:t>A ’</w:t>
+      </w:r>
+      <w:proofErr w:type="spellStart"/>
+      <w:r>
+        <w:rPr>
+          <w:sz w:val="24"/>
+          <w:szCs w:val="24"/>
+        </w:rPr>
+        <w:t>recipe_steps</w:t>
+      </w:r>
+      <w:proofErr w:type="spellEnd"/>
+      <w:r>
+        <w:rPr>
+          <w:sz w:val="24"/>
+          <w:szCs w:val="24"/>
+        </w:rPr>
+        <w:t>’ tábla tárolja a receptekhez kapcsolódó elkészítés lépéseinek sorszámát és tartalmát.</w:t>
+      </w:r>
+    </w:p>
+    <w:p>
+      <w:pPr>
+        <w:spacing w:after="0" w:line="360" w:lineRule="auto"/>
+        <w:rPr>
+          <w:sz w:val="24"/>
+          <w:szCs w:val="24"/>
+        </w:rPr>
+      </w:pPr>
+      <w:proofErr w:type="spellStart"/>
+      <w:r>
+        <w:rPr>
+          <w:b/>
+          <w:sz w:val="24"/>
+          <w:szCs w:val="24"/>
+        </w:rPr>
+        <w:t>id</w:t>
+      </w:r>
+      <w:proofErr w:type="spellEnd"/>
+      <w:r>
+        <w:rPr>
+          <w:sz w:val="24"/>
+          <w:szCs w:val="24"/>
+        </w:rPr>
+        <w:t>: A lépés ID-ja.</w:t>
+      </w:r>
+    </w:p>
+    <w:p>
+      <w:pPr>
+        <w:spacing w:after="0" w:line="360" w:lineRule="auto"/>
+        <w:rPr>
+          <w:sz w:val="24"/>
+          <w:szCs w:val="24"/>
+        </w:rPr>
+      </w:pPr>
+      <w:proofErr w:type="spellStart"/>
+      <w:r>
+        <w:rPr>
+          <w:b/>
+          <w:sz w:val="24"/>
+          <w:szCs w:val="24"/>
+        </w:rPr>
+        <w:t>recipe_id</w:t>
+      </w:r>
+      <w:proofErr w:type="spellEnd"/>
+      <w:r>
+        <w:rPr>
+          <w:sz w:val="24"/>
+          <w:szCs w:val="24"/>
+        </w:rPr>
+        <w:t>: A lépéshez kapcsolódó recept ID-ja</w:t>
+      </w:r>
+      <w:r>
+        <w:rPr>
+          <w:sz w:val="24"/>
+          <w:szCs w:val="24"/>
+        </w:rPr>
+        <w:t>.</w:t>
+      </w:r>
+    </w:p>
+    <w:p>
+      <w:pPr>
+        <w:spacing w:after="0" w:line="360" w:lineRule="auto"/>
+        <w:rPr>
+          <w:sz w:val="24"/>
+          <w:szCs w:val="24"/>
+        </w:rPr>
+      </w:pPr>
+      <w:proofErr w:type="spellStart"/>
+      <w:r>
+        <w:rPr>
+          <w:b/>
+          <w:sz w:val="24"/>
+          <w:szCs w:val="24"/>
+        </w:rPr>
+        <w:t>step_no</w:t>
+      </w:r>
+      <w:proofErr w:type="spellEnd"/>
+      <w:r>
+        <w:rPr>
+          <w:sz w:val="24"/>
+          <w:szCs w:val="24"/>
+        </w:rPr>
+        <w:t>: A lépés sorszáma.</w:t>
+      </w:r>
+    </w:p>
+    <w:p>
+      <w:pPr>
+        <w:spacing w:after="0" w:line="360" w:lineRule="auto"/>
+        <w:rPr>
+          <w:sz w:val="24"/>
+          <w:szCs w:val="24"/>
+        </w:rPr>
+      </w:pPr>
+      <w:proofErr w:type="spellStart"/>
+      <w:r>
+        <w:rPr>
+          <w:b/>
+          <w:sz w:val="24"/>
+          <w:szCs w:val="24"/>
+        </w:rPr>
+        <w:t>step_text</w:t>
+      </w:r>
+      <w:proofErr w:type="spellEnd"/>
+      <w:r>
+        <w:rPr>
+          <w:sz w:val="24"/>
+          <w:szCs w:val="24"/>
+        </w:rPr>
+        <w:t>: A lépés leírása</w:t>
+      </w:r>
+      <w:r>
+        <w:rPr>
+          <w:sz w:val="24"/>
+          <w:szCs w:val="24"/>
+        </w:rPr>
+        <w:t>.</w:t>
+      </w:r>
+    </w:p>
+    <w:p>
+      <w:pPr>
+        <w:spacing w:after="0" w:line="360" w:lineRule="auto"/>
+        <w:jc w:val="center"/>
+        <w:rPr>
+          <w:b/>
+          <w:sz w:val="32"/>
+          <w:szCs w:val="32"/>
+        </w:rPr>
+      </w:pPr>
+      <w:r>
+        <w:rPr>
+          <w:b/>
+          <w:sz w:val="32"/>
+          <w:szCs w:val="32"/>
+        </w:rPr>
+        <w:t>A ’</w:t>
+      </w:r>
+      <w:proofErr w:type="spellStart"/>
+      <w:r>
+        <w:rPr>
+          <w:b/>
+          <w:sz w:val="32"/>
+          <w:szCs w:val="32"/>
+        </w:rPr>
+        <w:t>recipe_likes</w:t>
+      </w:r>
+      <w:proofErr w:type="spellEnd"/>
+      <w:r>
+        <w:rPr>
+          <w:b/>
+          <w:sz w:val="32"/>
+          <w:szCs w:val="32"/>
+        </w:rPr>
+        <w:t>’ tábla</w:t>
+      </w:r>
+    </w:p>
+    <w:p>
+      <w:pPr>
+        <w:spacing w:after="0" w:line="360" w:lineRule="auto"/>
+        <w:rPr>
+          <w:sz w:val="24"/>
+          <w:szCs w:val="32"/>
+        </w:rPr>
+      </w:pPr>
+      <w:r>
+        <w:rPr>
+          <w:b/>
+          <w:noProof/>
+          <w:sz w:val="32"/>
+          <w:szCs w:val="32"/>
+        </w:rPr>
+        <w:drawing>
+          <wp:anchor distT="0" distB="0" distL="114300" distR="114300" simplePos="0" relativeHeight="251668480" behindDoc="1" locked="0" layoutInCell="1" allowOverlap="1">
+            <wp:simplePos x="0" y="0"/>
+            <wp:positionH relativeFrom="margin">
+              <wp:align>left</wp:align>
+            </wp:positionH>
+            <wp:positionV relativeFrom="paragraph">
+              <wp:posOffset>5715</wp:posOffset>
+            </wp:positionV>
+            <wp:extent cx="1878965" cy="1209675"/>
+            <wp:effectExtent l="0" t="0" r="6985" b="9525"/>
+            <wp:wrapTight wrapText="bothSides">
+              <wp:wrapPolygon edited="0">
+                <wp:start x="0" y="0"/>
+                <wp:lineTo x="0" y="21430"/>
+                <wp:lineTo x="21461" y="21430"/>
+                <wp:lineTo x="21461" y="0"/>
+                <wp:lineTo x="0" y="0"/>
+              </wp:wrapPolygon>
+            </wp:wrapTight>
+            <wp:docPr id="12" name="Kép 12"/>
+            <wp:cNvGraphicFramePr>
+              <a:graphicFrameLocks xmlns:a="http://schemas.openxmlformats.org/drawingml/2006/main" noChangeAspect="1"/>
+            </wp:cNvGraphicFramePr>
+            <a:graphic xmlns:a="http://schemas.openxmlformats.org/drawingml/2006/main">
+              <a:graphicData uri="http://schemas.openxmlformats.org/drawingml/2006/picture">
+                <pic:pic xmlns:pic="http://schemas.openxmlformats.org/drawingml/2006/picture">
+                  <pic:nvPicPr>
+                    <pic:cNvPr id="12" name="likes.PNG"/>
+                    <pic:cNvPicPr/>
+                  </pic:nvPicPr>
+                  <pic:blipFill>
+                    <a:blip r:embed="rId17">
+                      <a:extLst>
+                        <a:ext uri="{28A0092B-C50C-407E-A947-70E740481C1C}">
+                          <a14:useLocalDpi xmlns:a14="http://schemas.microsoft.com/office/drawing/2010/main" val="0"/>
+                        </a:ext>
+                      </a:extLst>
+                    </a:blip>
+                    <a:stretch>
+                      <a:fillRect/>
+                    </a:stretch>
+                  </pic:blipFill>
+                  <pic:spPr>
+                    <a:xfrm>
+                      <a:off x="0" y="0"/>
+                      <a:ext cx="1878965" cy="1209675"/>
+                    </a:xfrm>
+                    <a:prstGeom prst="rect">
+                      <a:avLst/>
+                    </a:prstGeom>
+                  </pic:spPr>
+                </pic:pic>
+              </a:graphicData>
+            </a:graphic>
+            <wp14:sizeRelH relativeFrom="margin">
+              <wp14:pctWidth>0</wp14:pctWidth>
+            </wp14:sizeRelH>
+            <wp14:sizeRelV relativeFrom="margin">
+              <wp14:pctHeight>0</wp14:pctHeight>
+            </wp14:sizeRelV>
+          </wp:anchor>
+        </w:drawing>
+      </w:r>
+      <w:r>
+        <w:rPr>
+          <w:sz w:val="24"/>
+          <w:szCs w:val="32"/>
+        </w:rPr>
+        <w:t>A ’</w:t>
+      </w:r>
+      <w:proofErr w:type="spellStart"/>
+      <w:r>
+        <w:rPr>
+          <w:sz w:val="24"/>
+          <w:szCs w:val="32"/>
+        </w:rPr>
+        <w:t>recipe_likes</w:t>
+      </w:r>
+      <w:proofErr w:type="spellEnd"/>
+      <w:r>
+        <w:rPr>
+          <w:sz w:val="24"/>
+          <w:szCs w:val="32"/>
+        </w:rPr>
+        <w:t>’ tábla tárolja, hogy egy felhasználó, mely recepteket kedvelte.</w:t>
+      </w:r>
+    </w:p>
+    <w:p>
+      <w:pPr>
+        <w:spacing w:after="0" w:line="360" w:lineRule="auto"/>
+        <w:rPr>
+          <w:sz w:val="24"/>
+          <w:szCs w:val="32"/>
+        </w:rPr>
+      </w:pPr>
+      <w:proofErr w:type="spellStart"/>
+      <w:r>
+        <w:rPr>
+          <w:sz w:val="24"/>
+          <w:szCs w:val="32"/>
+        </w:rPr>
+        <w:t>id</w:t>
+      </w:r>
+      <w:proofErr w:type="spellEnd"/>
+      <w:r>
+        <w:rPr>
+          <w:sz w:val="24"/>
+          <w:szCs w:val="32"/>
+        </w:rPr>
+        <w:t>: A kedvelés ID-ja</w:t>
+      </w:r>
+      <w:r>
+        <w:rPr>
+          <w:sz w:val="24"/>
+          <w:szCs w:val="32"/>
+        </w:rPr>
+        <w:t>.</w:t>
+      </w:r>
+    </w:p>
+    <w:p>
+      <w:pPr>
+        <w:spacing w:after="0" w:line="360" w:lineRule="auto"/>
+        <w:rPr>
+          <w:sz w:val="24"/>
+          <w:szCs w:val="32"/>
+        </w:rPr>
+      </w:pPr>
+      <w:proofErr w:type="spellStart"/>
+      <w:r>
+        <w:rPr>
+          <w:sz w:val="24"/>
+          <w:szCs w:val="32"/>
+        </w:rPr>
+        <w:t>user_id</w:t>
+      </w:r>
+      <w:proofErr w:type="spellEnd"/>
+      <w:r>
+        <w:rPr>
+          <w:sz w:val="24"/>
+          <w:szCs w:val="32"/>
+        </w:rPr>
+        <w:t>: A felhasználó ID-ja.</w:t>
+      </w:r>
+    </w:p>
+    <w:p>
+      <w:pPr>
+        <w:spacing w:after="0" w:line="360" w:lineRule="auto"/>
+        <w:rPr>
+          <w:sz w:val="24"/>
+          <w:szCs w:val="32"/>
+        </w:rPr>
+      </w:pPr>
+      <w:proofErr w:type="spellStart"/>
+      <w:r>
+        <w:rPr>
+          <w:sz w:val="24"/>
+          <w:szCs w:val="32"/>
+        </w:rPr>
+        <w:t>recipe_id</w:t>
+      </w:r>
+      <w:proofErr w:type="spellEnd"/>
+      <w:r>
+        <w:rPr>
+          <w:sz w:val="24"/>
+          <w:szCs w:val="32"/>
+        </w:rPr>
+        <w:t>: A kedvelt recept ID-ja.</w:t>
+      </w:r>
+    </w:p>
+    <w:p>
+      <w:pPr>
+        <w:spacing w:after="0" w:line="360" w:lineRule="auto"/>
+        <w:jc w:val="center"/>
+        <w:rPr>
+          <w:b/>
+          <w:sz w:val="32"/>
+          <w:szCs w:val="32"/>
+        </w:rPr>
+      </w:pPr>
+      <w:r>
+        <w:rPr>
+          <w:b/>
+          <w:sz w:val="32"/>
+          <w:szCs w:val="32"/>
+        </w:rPr>
+        <w:t>A ’</w:t>
+      </w:r>
+      <w:proofErr w:type="spellStart"/>
+      <w:r>
+        <w:rPr>
+          <w:b/>
+          <w:sz w:val="32"/>
+          <w:szCs w:val="32"/>
+        </w:rPr>
+        <w:t>menu_plan</w:t>
+      </w:r>
+      <w:proofErr w:type="spellEnd"/>
+      <w:r>
+        <w:rPr>
+          <w:b/>
+          <w:sz w:val="32"/>
+          <w:szCs w:val="32"/>
+        </w:rPr>
+        <w:t>’ tábla</w:t>
+      </w:r>
+    </w:p>
+    <w:p>
+      <w:pPr>
+        <w:spacing w:after="0" w:line="360" w:lineRule="auto"/>
+        <w:jc w:val="center"/>
+        <w:rPr>
+          <w:b/>
+          <w:sz w:val="32"/>
+          <w:szCs w:val="32"/>
+        </w:rPr>
+      </w:pPr>
+      <w:r>
+        <w:rPr>
+          <w:b/>
+          <w:noProof/>
+          <w:sz w:val="32"/>
+          <w:szCs w:val="32"/>
+        </w:rPr>
+        <w:drawing>
+          <wp:inline distT="0" distB="0" distL="0" distR="0">
+            <wp:extent cx="3713670" cy="1577130"/>
+            <wp:effectExtent l="0" t="0" r="1270" b="4445"/>
+            <wp:docPr id="13" name="Kép 13"/>
+            <wp:cNvGraphicFramePr>
+              <a:graphicFrameLocks xmlns:a="http://schemas.openxmlformats.org/drawingml/2006/main" noChangeAspect="1"/>
+            </wp:cNvGraphicFramePr>
+            <a:graphic xmlns:a="http://schemas.openxmlformats.org/drawingml/2006/main">
+              <a:graphicData uri="http://schemas.openxmlformats.org/drawingml/2006/picture">
+                <pic:pic xmlns:pic="http://schemas.openxmlformats.org/drawingml/2006/picture">
+                  <pic:nvPicPr>
+                    <pic:cNvPr id="13" name="menuplan.PNG"/>
+                    <pic:cNvPicPr/>
+                  </pic:nvPicPr>
+                  <pic:blipFill>
+                    <a:blip r:embed="rId18">
+                      <a:extLst>
+                        <a:ext uri="{28A0092B-C50C-407E-A947-70E740481C1C}">
+                          <a14:useLocalDpi xmlns:a14="http://schemas.microsoft.com/office/drawing/2010/main" val="0"/>
+                        </a:ext>
+                      </a:extLst>
+                    </a:blip>
+                    <a:stretch>
+                      <a:fillRect/>
+                    </a:stretch>
+                  </pic:blipFill>
+                  <pic:spPr>
+                    <a:xfrm>
+                      <a:off x="0" y="0"/>
+                      <a:ext cx="3748908" cy="1592095"/>
+                    </a:xfrm>
+                    <a:prstGeom prst="rect">
+                      <a:avLst/>
+                    </a:prstGeom>
+                  </pic:spPr>
+                </pic:pic>
+              </a:graphicData>
+            </a:graphic>
+          </wp:inline>
+        </w:drawing>
+      </w:r>
+      <w:bookmarkStart w:id="0" w:name="_GoBack"/>
+      <w:bookmarkEnd w:id="0"/>
     </w:p>
     <w:sectPr>
       <w:pgSz w:w="11906" w:h="16838"/>
@@ -4573,7 +5882,7 @@
 </file>
 
 <file path=customXml/itemProps1.xml><?xml version="1.0" encoding="utf-8"?>
-<ds:datastoreItem xmlns:ds="http://schemas.openxmlformats.org/officeDocument/2006/customXml" ds:itemID="{374D59E8-939B-4DDE-9E75-39D440883CC5}">
+<ds:datastoreItem xmlns:ds="http://schemas.openxmlformats.org/officeDocument/2006/customXml" ds:itemID="{D9D6F0AE-1B15-4289-A9DF-CEF816AEC200}">
   <ds:schemaRefs>
     <ds:schemaRef ds:uri="http://schemas.openxmlformats.org/officeDocument/2006/bibliography"/>
   </ds:schemaRefs>

</xml_diff>